<commit_message>
Added pie rule, cleaned up code as specified in clean code lecture notes
</commit_message>
<xml_diff>
--- a/Sprint2_FeaturesDoc.docx
+++ b/Sprint2_FeaturesDoc.docx
@@ -6,12 +6,16 @@
       <w:pPr>
         <w:jc w:val="center"/>
         <w:rPr>
+          <w:b/>
+          <w:bCs/>
           <w:sz w:val="48"/>
           <w:szCs w:val="48"/>
         </w:rPr>
       </w:pPr>
       <w:r>
         <w:rPr>
+          <w:b/>
+          <w:bCs/>
           <w:sz w:val="48"/>
           <w:szCs w:val="48"/>
         </w:rPr>
@@ -20,24 +24,19 @@
     </w:p>
     <w:p>
       <w:pPr>
-        <w:jc w:val="center"/>
-        <w:rPr>
-          <w:sz w:val="48"/>
-          <w:szCs w:val="48"/>
-        </w:rPr>
-      </w:pPr>
-    </w:p>
-    <w:p>
-      <w:pPr>
         <w:rPr>
           <w:b/>
           <w:bCs/>
+          <w:sz w:val="32"/>
+          <w:szCs w:val="32"/>
         </w:rPr>
       </w:pPr>
       <w:r>
         <w:rPr>
           <w:b/>
           <w:bCs/>
+          <w:sz w:val="32"/>
+          <w:szCs w:val="32"/>
         </w:rPr>
         <w:t>Features we added (Sprint 2 Roadmap):</w:t>
       </w:r>
@@ -53,19 +52,36 @@
           <w:ilvl w:val="0"/>
           <w:numId w:val="3"/>
         </w:numPr>
+        <w:rPr>
+          <w:sz w:val="24"/>
+          <w:szCs w:val="24"/>
+        </w:rPr>
       </w:pPr>
       <w:r>
         <w:rPr>
           <w:b/>
           <w:bCs/>
+          <w:sz w:val="24"/>
+          <w:szCs w:val="24"/>
         </w:rPr>
         <w:t xml:space="preserve">SR5.1/5.2: </w:t>
       </w:r>
       <w:r>
+        <w:rPr>
+          <w:sz w:val="24"/>
+          <w:szCs w:val="24"/>
+        </w:rPr>
         <w:t>Allow the current player to place a piece on any unoccupied octagonal cell on the board</w:t>
       </w:r>
     </w:p>
-    <w:p/>
+    <w:p>
+      <w:pPr>
+        <w:rPr>
+          <w:sz w:val="24"/>
+          <w:szCs w:val="24"/>
+        </w:rPr>
+      </w:pPr>
+    </w:p>
     <w:p>
       <w:pPr>
         <w:numPr>
@@ -75,35 +91,60 @@
         <w:rPr>
           <w:b/>
           <w:bCs/>
+          <w:sz w:val="24"/>
+          <w:szCs w:val="24"/>
         </w:rPr>
       </w:pPr>
       <w:r>
         <w:rPr>
           <w:b/>
           <w:bCs/>
+          <w:sz w:val="24"/>
+          <w:szCs w:val="24"/>
         </w:rPr>
         <w:t xml:space="preserve">SR5.1/5.2: </w:t>
       </w:r>
       <w:r>
+        <w:rPr>
+          <w:sz w:val="24"/>
+          <w:szCs w:val="24"/>
+        </w:rPr>
         <w:t>Allow the current player to place a piece on any unoccupied rhombus cell on the board</w:t>
       </w:r>
     </w:p>
-    <w:p/>
+    <w:p>
+      <w:pPr>
+        <w:rPr>
+          <w:sz w:val="24"/>
+          <w:szCs w:val="24"/>
+        </w:rPr>
+      </w:pPr>
+    </w:p>
     <w:p>
       <w:pPr>
         <w:numPr>
           <w:ilvl w:val="0"/>
           <w:numId w:val="1"/>
         </w:numPr>
+        <w:rPr>
+          <w:sz w:val="24"/>
+          <w:szCs w:val="24"/>
+        </w:rPr>
       </w:pPr>
       <w:r>
         <w:rPr>
           <w:b/>
           <w:bCs/>
+          <w:sz w:val="24"/>
+          <w:szCs w:val="24"/>
         </w:rPr>
         <w:t xml:space="preserve">SR2.2: </w:t>
       </w:r>
       <w:r>
+        <w:rPr>
+          <w:sz w:val="24"/>
+          <w:szCs w:val="24"/>
+        </w:rPr>
         <w:t>After a valid move the players switch turns and the turn indicator updates to the correct player</w:t>
       </w:r>
     </w:p>
@@ -114,25 +155,14 @@
           <w:szCs w:val="24"/>
         </w:rPr>
       </w:pPr>
-    </w:p>
-    <w:p>
-      <w:pPr>
-        <w:ind w:left="720"/>
+      <w:r>
         <w:rPr>
           <w:b/>
           <w:bCs/>
-          <w:sz w:val="24"/>
-          <w:szCs w:val="24"/>
-        </w:rPr>
-      </w:pPr>
-      <w:r>
-        <w:rPr>
-          <w:b/>
-          <w:bCs/>
-          <w:sz w:val="24"/>
-          <w:szCs w:val="24"/>
-        </w:rPr>
-        <w:t>We used JUnit 5 logic tests and TestFX UI tests.</w:t>
+          <w:sz w:val="32"/>
+          <w:szCs w:val="32"/>
+        </w:rPr>
+        <w:t>Testing we added (at least one per feature)</w:t>
       </w:r>
     </w:p>
     <w:tbl>
@@ -689,14 +719,7 @@
           <w:sz w:val="24"/>
           <w:szCs w:val="24"/>
         </w:rPr>
-        <w:t>A feature that prevents placing a piece on an occupied cell and gives clear feedback to the user.</w:t>
-      </w:r>
-      <w:r>
-        <w:rPr>
-          <w:sz w:val="24"/>
-          <w:szCs w:val="24"/>
-        </w:rPr>
-        <w:t>”</w:t>
+        <w:t>A feature that prevents placing a piece on an occupied cell and gives clear feedback to the user.”</w:t>
       </w:r>
     </w:p>
     <w:p>
@@ -710,12 +733,49 @@
           <w:szCs w:val="24"/>
         </w:rPr>
       </w:pPr>
+      <w:bookmarkStart w:id="1" w:name="_fw7oho8ahkyx" w:colFirst="0" w:colLast="0"/>
+      <w:bookmarkEnd w:id="1"/>
       <w:r>
         <w:rPr>
           <w:sz w:val="24"/>
           <w:szCs w:val="24"/>
         </w:rPr>
-        <w:t>• Instead of placing piece icons, the board changes the cell colour to represent ownership of octagon and rhombus cells.</w:t>
+        <w:t>• Move validation</w:t>
+      </w:r>
+      <w:r>
+        <w:rPr>
+          <w:sz w:val="24"/>
+          <w:szCs w:val="24"/>
+        </w:rPr>
+        <w:t xml:space="preserve"> and the current game state</w:t>
+      </w:r>
+      <w:r>
+        <w:rPr>
+          <w:sz w:val="24"/>
+          <w:szCs w:val="24"/>
+        </w:rPr>
+        <w:t xml:space="preserve"> </w:t>
+      </w:r>
+      <w:r>
+        <w:rPr>
+          <w:sz w:val="24"/>
+          <w:szCs w:val="24"/>
+        </w:rPr>
+        <w:t>were separated into</w:t>
+      </w:r>
+      <w:r>
+        <w:rPr>
+          <w:sz w:val="24"/>
+          <w:szCs w:val="24"/>
+        </w:rPr>
+        <w:t xml:space="preserve"> game logic classes, ensuring </w:t>
+      </w:r>
+      <w:r>
+        <w:rPr>
+          <w:sz w:val="24"/>
+          <w:szCs w:val="24"/>
+        </w:rPr>
+        <w:t>all code is not in one file.</w:t>
       </w:r>
     </w:p>
     <w:p>
@@ -729,47 +789,12 @@
           <w:szCs w:val="24"/>
         </w:rPr>
       </w:pPr>
-      <w:bookmarkStart w:id="1" w:name="_fw7oho8ahkyx" w:colFirst="0" w:colLast="0"/>
-      <w:bookmarkEnd w:id="1"/>
       <w:r>
         <w:rPr>
           <w:sz w:val="24"/>
           <w:szCs w:val="24"/>
         </w:rPr>
-        <w:t>• Move validation is handled by the game logic classes, ensuring the UI cannot place pieces on occupied cells</w:t>
-      </w:r>
-      <w:r>
-        <w:rPr>
-          <w:sz w:val="24"/>
-          <w:szCs w:val="24"/>
-        </w:rPr>
-        <w:t>.</w:t>
-      </w:r>
-    </w:p>
-    <w:p>
-      <w:pPr>
-        <w:pStyle w:val="Heading2"/>
-        <w:keepNext w:val="0"/>
-        <w:keepLines w:val="0"/>
-        <w:spacing w:before="240" w:after="240"/>
-        <w:rPr>
-          <w:sz w:val="24"/>
-          <w:szCs w:val="24"/>
-        </w:rPr>
-      </w:pPr>
-      <w:r>
-        <w:rPr>
-          <w:sz w:val="24"/>
-          <w:szCs w:val="24"/>
-        </w:rPr>
-        <w:t xml:space="preserve">• </w:t>
-      </w:r>
-      <w:r>
-        <w:rPr>
-          <w:sz w:val="24"/>
-          <w:szCs w:val="24"/>
-        </w:rPr>
-        <w:t>Added JAR file.</w:t>
+        <w:t>• Added JAR file.</w:t>
       </w:r>
     </w:p>
     <w:p/>

</xml_diff>